<commit_message>
feat: enhance McpTools and MlMetrics pages with improved UI and functionality
- Updated McpTools page to include better styling, tooltips, and enhanced table rendering.
- Added new icons and improved layout for better user experience.
- Enhanced MlMetrics page with improved statistics display and feature importance visualization.
- Introduced global CSS styles for consistent design across the application.
- Added animations for smoother transitions and interactions.
</commit_message>
<xml_diff>
--- a/06.docx
+++ b/06.docx
@@ -1151,7 +1151,70 @@
                 <w:szCs w:val="28"/>
                 <w:lang w:val="en-US" w:eastAsia="zh-CN"/>
               </w:rPr>
-              <w:t>综合利用上市公司公告、定期报告、监管问询函及回复、财务指标和市场舆情等多源数据，基于大语言模型与 Agentic AI 技术构建自主规划型上市公司扫雷智能体，实现对上市公司未来受到监管问询概率的预测、风险诱因归因及可解释预警报告生成。</w:t>
+              <w:t>综合利用上市公司公告、定期报告、监管问询函及回复、财务指标和市场舆情等多源数据，基于大语言模型与 Agentic AI 技术构建自主规划型上市公司扫雷智能体，实现对上市公司未来受到</w:t>
+            </w:r>
+            <w:r>
+              <w:rPr>
+                <w:rFonts w:hint="eastAsia" w:ascii="仿宋" w:hAnsi="仿宋" w:eastAsia="仿宋" w:cs="仿宋"/>
+                <w:color w:val="000000"/>
+                <w:sz w:val="28"/>
+                <w:szCs w:val="28"/>
+                <w:highlight w:val="yellow"/>
+                <w:lang w:val="en-US" w:eastAsia="zh-CN"/>
+              </w:rPr>
+              <w:t>监管问询概率的预测</w:t>
+            </w:r>
+            <w:r>
+              <w:rPr>
+                <w:rFonts w:hint="eastAsia" w:ascii="仿宋" w:hAnsi="仿宋" w:eastAsia="仿宋" w:cs="仿宋"/>
+                <w:color w:val="000000"/>
+                <w:sz w:val="28"/>
+                <w:szCs w:val="28"/>
+                <w:lang w:val="en-US" w:eastAsia="zh-CN"/>
+              </w:rPr>
+              <w:t>、</w:t>
+            </w:r>
+            <w:r>
+              <w:rPr>
+                <w:rFonts w:hint="eastAsia" w:ascii="仿宋" w:hAnsi="仿宋" w:eastAsia="仿宋" w:cs="仿宋"/>
+                <w:color w:val="000000"/>
+                <w:sz w:val="28"/>
+                <w:szCs w:val="28"/>
+                <w:highlight w:val="yellow"/>
+                <w:lang w:val="en-US" w:eastAsia="zh-CN"/>
+              </w:rPr>
+              <w:t>风险诱因归因</w:t>
+            </w:r>
+            <w:r>
+              <w:rPr>
+                <w:rFonts w:hint="eastAsia" w:ascii="仿宋" w:hAnsi="仿宋" w:eastAsia="仿宋" w:cs="仿宋"/>
+                <w:color w:val="000000"/>
+                <w:sz w:val="28"/>
+                <w:szCs w:val="28"/>
+                <w:lang w:val="en-US" w:eastAsia="zh-CN"/>
+              </w:rPr>
+              <w:t>及</w:t>
+            </w:r>
+            <w:r>
+              <w:rPr>
+                <w:rFonts w:hint="eastAsia" w:ascii="仿宋" w:hAnsi="仿宋" w:eastAsia="仿宋" w:cs="仿宋"/>
+                <w:color w:val="000000"/>
+                <w:sz w:val="28"/>
+                <w:szCs w:val="28"/>
+                <w:highlight w:val="yellow"/>
+                <w:lang w:val="en-US" w:eastAsia="zh-CN"/>
+              </w:rPr>
+              <w:t>可解释预警报告生成</w:t>
+            </w:r>
+            <w:r>
+              <w:rPr>
+                <w:rFonts w:hint="eastAsia" w:ascii="仿宋" w:hAnsi="仿宋" w:eastAsia="仿宋" w:cs="仿宋"/>
+                <w:color w:val="000000"/>
+                <w:sz w:val="28"/>
+                <w:szCs w:val="28"/>
+                <w:lang w:val="en-US" w:eastAsia="zh-CN"/>
+              </w:rPr>
+              <w:t>。</w:t>
             </w:r>
           </w:p>
         </w:tc>
@@ -1467,7 +1530,49 @@
                 <w:szCs w:val="28"/>
                 <w:lang w:val="en-US" w:eastAsia="zh-CN"/>
               </w:rPr>
-              <w:t>1、复杂信息披露语境下的监管关注点识别与防幻觉推理。如何让大语言模型准确理解公告、年报、问询函及回复中的财务异常、披露矛盾、交易实质和监管关注语义，并避免在长文本、多表格、多公告链路中产生错误归因或无依据推断？</w:t>
+              <w:t>1、复杂信息披露语境下的</w:t>
+            </w:r>
+            <w:r>
+              <w:rPr>
+                <w:rFonts w:hint="eastAsia" w:ascii="Times New Roman" w:hAnsi="Times New Roman" w:eastAsia="仿宋" w:cs="Times New Roman"/>
+                <w:color w:val="000000"/>
+                <w:sz w:val="28"/>
+                <w:szCs w:val="28"/>
+                <w:highlight w:val="yellow"/>
+                <w:lang w:val="en-US" w:eastAsia="zh-CN"/>
+              </w:rPr>
+              <w:t>监管关注点识别</w:t>
+            </w:r>
+            <w:r>
+              <w:rPr>
+                <w:rFonts w:hint="eastAsia" w:ascii="Times New Roman" w:hAnsi="Times New Roman" w:eastAsia="仿宋" w:cs="Times New Roman"/>
+                <w:color w:val="000000"/>
+                <w:sz w:val="28"/>
+                <w:szCs w:val="28"/>
+                <w:lang w:val="en-US" w:eastAsia="zh-CN"/>
+              </w:rPr>
+              <w:t>与</w:t>
+            </w:r>
+            <w:r>
+              <w:rPr>
+                <w:rFonts w:hint="eastAsia" w:ascii="Times New Roman" w:hAnsi="Times New Roman" w:eastAsia="仿宋" w:cs="Times New Roman"/>
+                <w:color w:val="000000"/>
+                <w:sz w:val="28"/>
+                <w:szCs w:val="28"/>
+                <w:highlight w:val="yellow"/>
+                <w:lang w:val="en-US" w:eastAsia="zh-CN"/>
+              </w:rPr>
+              <w:t>防幻觉推理</w:t>
+            </w:r>
+            <w:r>
+              <w:rPr>
+                <w:rFonts w:hint="eastAsia" w:ascii="Times New Roman" w:hAnsi="Times New Roman" w:eastAsia="仿宋" w:cs="Times New Roman"/>
+                <w:color w:val="000000"/>
+                <w:sz w:val="28"/>
+                <w:szCs w:val="28"/>
+                <w:lang w:val="en-US" w:eastAsia="zh-CN"/>
+              </w:rPr>
+              <w:t>。如何让大语言模型准确理解公告、年报、问询函及回复中的财务异常、披露矛盾、交易实质和监管关注语义，并避免在长文本、多表格、多公告链路中产生错误归因或无依据推断？</w:t>
             </w:r>
           </w:p>
           <w:p>
@@ -1491,7 +1596,28 @@
                 <w:szCs w:val="28"/>
                 <w:lang w:val="en-US" w:eastAsia="zh-CN"/>
               </w:rPr>
-              <w:t>2、历史监管问询样本驱动的被问询概率预测。如何以历史监管问询函及回复作为标签或弱监督依据，将公告文本、财务指标、市场表现、舆情事件、公司治理特征等异构信息转化为可建模特征，预测上市公司在未来窗口期内受到监管问询的概率？</w:t>
+              <w:t>2、历史监管问询样本驱动的</w:t>
+            </w:r>
+            <w:r>
+              <w:rPr>
+                <w:rFonts w:hint="eastAsia" w:ascii="Times New Roman" w:hAnsi="Times New Roman" w:eastAsia="仿宋" w:cs="Times New Roman"/>
+                <w:color w:val="000000"/>
+                <w:sz w:val="28"/>
+                <w:szCs w:val="28"/>
+                <w:highlight w:val="yellow"/>
+                <w:lang w:val="en-US" w:eastAsia="zh-CN"/>
+              </w:rPr>
+              <w:t>被问询概率预测</w:t>
+            </w:r>
+            <w:r>
+              <w:rPr>
+                <w:rFonts w:hint="eastAsia" w:ascii="Times New Roman" w:hAnsi="Times New Roman" w:eastAsia="仿宋" w:cs="Times New Roman"/>
+                <w:color w:val="000000"/>
+                <w:sz w:val="28"/>
+                <w:szCs w:val="28"/>
+                <w:lang w:val="en-US" w:eastAsia="zh-CN"/>
+              </w:rPr>
+              <w:t>。如何以历史监管问询函及回复作为标签或弱监督依据，将公告文本、财务指标、市场表现、舆情事件、公司治理特征等异构信息转化为可建模特征，预测上市公司在未来窗口期内受到监管问询的概率？</w:t>
             </w:r>
           </w:p>
           <w:p>
@@ -1515,7 +1641,28 @@
                 <w:szCs w:val="28"/>
                 <w:lang w:val="en-US" w:eastAsia="zh-CN"/>
               </w:rPr>
-              <w:t>3、Agentic AI 自主规划分析流程的稳定性与可复现性。如何设计多智能体协同机制，使扫雷 Agent 能够自主拆解分析任务、调用公告检索、指标计算、同类案例比对、风险规则核验等 Skill，并在不同样本上保持一致、可追踪、可复现的推理路径？</w:t>
+              <w:t>3、Agentic AI 自主规划分析流程的</w:t>
+            </w:r>
+            <w:r>
+              <w:rPr>
+                <w:rFonts w:hint="eastAsia" w:ascii="Times New Roman" w:hAnsi="Times New Roman" w:eastAsia="仿宋" w:cs="Times New Roman"/>
+                <w:color w:val="000000"/>
+                <w:sz w:val="28"/>
+                <w:szCs w:val="28"/>
+                <w:highlight w:val="yellow"/>
+                <w:lang w:val="en-US" w:eastAsia="zh-CN"/>
+              </w:rPr>
+              <w:t>稳定性与可复现性</w:t>
+            </w:r>
+            <w:r>
+              <w:rPr>
+                <w:rFonts w:hint="eastAsia" w:ascii="Times New Roman" w:hAnsi="Times New Roman" w:eastAsia="仿宋" w:cs="Times New Roman"/>
+                <w:color w:val="000000"/>
+                <w:sz w:val="28"/>
+                <w:szCs w:val="28"/>
+                <w:lang w:val="en-US" w:eastAsia="zh-CN"/>
+              </w:rPr>
+              <w:t>。如何设计多智能体协同机制，使扫雷 Agent 能够自主拆解分析任务、调用公告检索、指标计算、同类案例比对、风险规则核验等 Skill，并在不同样本上保持一致、可追踪、可复现的推理路径？</w:t>
             </w:r>
           </w:p>
           <w:p>
@@ -1532,7 +1679,28 @@
                 <w:szCs w:val="28"/>
                 <w:lang w:val="en-US" w:eastAsia="zh-CN"/>
               </w:rPr>
-              <w:t>4、预测结果的可解释性与业务可用性。上市公司扫雷预警不能仅输出概率分数，还需要说明触发预测的关键风险因素、对应公告证据、相似历史问询案例和模型判断链路。现有黑盒模型难以满足投研、合规和风控人员的复核要求。</w:t>
+              <w:t>4、预测结果的</w:t>
+            </w:r>
+            <w:r>
+              <w:rPr>
+                <w:rFonts w:hint="eastAsia" w:ascii="Times New Roman" w:hAnsi="Times New Roman" w:eastAsia="仿宋" w:cs="Times New Roman"/>
+                <w:color w:val="000000"/>
+                <w:sz w:val="28"/>
+                <w:szCs w:val="28"/>
+                <w:highlight w:val="yellow"/>
+                <w:lang w:val="en-US" w:eastAsia="zh-CN"/>
+              </w:rPr>
+              <w:t>可解释性与业务可用性</w:t>
+            </w:r>
+            <w:r>
+              <w:rPr>
+                <w:rFonts w:hint="eastAsia" w:ascii="Times New Roman" w:hAnsi="Times New Roman" w:eastAsia="仿宋" w:cs="Times New Roman"/>
+                <w:color w:val="000000"/>
+                <w:sz w:val="28"/>
+                <w:szCs w:val="28"/>
+                <w:lang w:val="en-US" w:eastAsia="zh-CN"/>
+              </w:rPr>
+              <w:t>。上市公司扫雷预警不能仅输出概率分数，还需要说明触发预测的关键风险因素、对应公告证据、相似历史问询案例和模型判断链路。现有黑盒模型难以满足投研、合规和风控人员的复核要求。</w:t>
             </w:r>
           </w:p>
         </w:tc>
@@ -1632,10 +1800,29 @@
                 <w:szCs w:val="28"/>
                 <w:lang w:val="en-US" w:eastAsia="zh-CN"/>
               </w:rPr>
-              <w:t>聚焦解决复杂信息披露语境理解问题，参赛团队需构建面向上市公司公告、年报、监管问询函及回复的长文本解析与风险要素抽取模块，提取监管关注事项、被问询原因、公司回复要点、财务指标异常、披露矛盾、交易事项、会计处理争议等结构化信息，形成可用于建模的监管关注点标签体系与证据片段库。</w:t>
-            </w:r>
-            <w:bookmarkStart w:id="0" w:name="_GoBack"/>
-            <w:bookmarkEnd w:id="0"/>
+              <w:t>聚焦解决复杂信息披露语境理解问题，参赛团队需</w:t>
+            </w:r>
+            <w:r>
+              <w:rPr>
+                <w:rFonts w:hint="eastAsia" w:ascii="Times New Roman" w:hAnsi="Times New Roman" w:eastAsia="仿宋" w:cs="Times New Roman"/>
+                <w:color w:val="000000"/>
+                <w:sz w:val="28"/>
+                <w:szCs w:val="28"/>
+                <w:highlight w:val="yellow"/>
+                <w:lang w:val="en-US" w:eastAsia="zh-CN"/>
+              </w:rPr>
+              <w:t>构建面向上市公司公告、年报、监管问询函及回复的长文本解析与风险要素抽取模块</w:t>
+            </w:r>
+            <w:r>
+              <w:rPr>
+                <w:rFonts w:hint="eastAsia" w:ascii="Times New Roman" w:hAnsi="Times New Roman" w:eastAsia="仿宋" w:cs="Times New Roman"/>
+                <w:color w:val="000000"/>
+                <w:sz w:val="28"/>
+                <w:szCs w:val="28"/>
+                <w:lang w:val="en-US" w:eastAsia="zh-CN"/>
+              </w:rPr>
+              <w:t>，提取监管关注事项、被问询原因、公司回复要点、财务指标异常、披露矛盾、交易事项、会计处理争议等结构化信息，形成可用于建模的监管关注点标签体系与证据片段库。</w:t>
+            </w:r>
           </w:p>
           <w:p>
             <w:pPr>
@@ -1684,7 +1871,28 @@
                 <w:szCs w:val="28"/>
                 <w:lang w:val="en-US" w:eastAsia="zh-CN"/>
               </w:rPr>
-              <w:t>针对历史监管问询样本驱动的预测问题，参赛团队需构建预测模型或多模型集成框架，融合公告语义特征、财务异常特征、股价与成交异动、舆情热度、历史问询记录、行业与公司治理特征等信息，预测上市公司在未来 30/60/90 天内受到交易所或监管机构问询的概率，并输出风险等级排序。</w:t>
+              <w:t>针对历史监管问询样本驱动的预测问题，参赛团队需</w:t>
+            </w:r>
+            <w:r>
+              <w:rPr>
+                <w:rFonts w:hint="eastAsia" w:ascii="Times New Roman" w:hAnsi="Times New Roman" w:eastAsia="仿宋" w:cs="Times New Roman"/>
+                <w:color w:val="000000"/>
+                <w:sz w:val="28"/>
+                <w:szCs w:val="28"/>
+                <w:highlight w:val="yellow"/>
+                <w:lang w:val="en-US" w:eastAsia="zh-CN"/>
+              </w:rPr>
+              <w:t>构建预测模型或多模型集成框架</w:t>
+            </w:r>
+            <w:r>
+              <w:rPr>
+                <w:rFonts w:hint="eastAsia" w:ascii="Times New Roman" w:hAnsi="Times New Roman" w:eastAsia="仿宋" w:cs="Times New Roman"/>
+                <w:color w:val="000000"/>
+                <w:sz w:val="28"/>
+                <w:szCs w:val="28"/>
+                <w:lang w:val="en-US" w:eastAsia="zh-CN"/>
+              </w:rPr>
+              <w:t>，融合公告语义特征、财务异常特征、股价与成交异动、舆情热度、历史问询记录、行业与公司治理特征等信息，预测上市公司在未来 30/60/90 天内受到交易所或监管机构问询的概率，并输出风险等级排序。</w:t>
             </w:r>
           </w:p>
           <w:p>
@@ -1734,7 +1942,49 @@
                 <w:szCs w:val="28"/>
                 <w:lang w:val="en-US" w:eastAsia="zh-CN"/>
               </w:rPr>
-              <w:t>围绕 Agentic AI 分析流程稳定性问题，参赛团队需设计多智能体协作架构，例如公告研读 Agent、财务异常检测 Agent、监管案例检索 Agent、预测建模 Agent、归因解释 Agent 等，并将公告检索、问询案例匹配、财务指标计算、风险模板生成等能力封装为可复用 Skill，实现从输入公司列表到输出扫雷结果的自动化 Pipeline。</w:t>
+              <w:t>围绕 Agentic AI 分析流程稳定性问题，参赛团队需</w:t>
+            </w:r>
+            <w:r>
+              <w:rPr>
+                <w:rFonts w:hint="eastAsia" w:ascii="Times New Roman" w:hAnsi="Times New Roman" w:eastAsia="仿宋" w:cs="Times New Roman"/>
+                <w:color w:val="000000"/>
+                <w:sz w:val="28"/>
+                <w:szCs w:val="28"/>
+                <w:highlight w:val="yellow"/>
+                <w:lang w:val="en-US" w:eastAsia="zh-CN"/>
+              </w:rPr>
+              <w:t>设计多智能体协作架构</w:t>
+            </w:r>
+            <w:r>
+              <w:rPr>
+                <w:rFonts w:hint="eastAsia" w:ascii="Times New Roman" w:hAnsi="Times New Roman" w:eastAsia="仿宋" w:cs="Times New Roman"/>
+                <w:color w:val="000000"/>
+                <w:sz w:val="28"/>
+                <w:szCs w:val="28"/>
+                <w:lang w:val="en-US" w:eastAsia="zh-CN"/>
+              </w:rPr>
+              <w:t>，例如公告研读 Agent、财务异常检测 Agent、监管案例检索 Agent、预测建模 Agent、归因解释 Agent 等，并将公告检索、问询案例匹配、财务指标计算、风险模板生成等能力封装为可复用 Skill，</w:t>
+            </w:r>
+            <w:r>
+              <w:rPr>
+                <w:rFonts w:hint="eastAsia" w:ascii="Times New Roman" w:hAnsi="Times New Roman" w:eastAsia="仿宋" w:cs="Times New Roman"/>
+                <w:color w:val="000000"/>
+                <w:sz w:val="28"/>
+                <w:szCs w:val="28"/>
+                <w:highlight w:val="yellow"/>
+                <w:lang w:val="en-US" w:eastAsia="zh-CN"/>
+              </w:rPr>
+              <w:t>实现从输入公司列表到输出扫雷结果的自动化 Pipeline</w:t>
+            </w:r>
+            <w:r>
+              <w:rPr>
+                <w:rFonts w:hint="eastAsia" w:ascii="Times New Roman" w:hAnsi="Times New Roman" w:eastAsia="仿宋" w:cs="Times New Roman"/>
+                <w:color w:val="000000"/>
+                <w:sz w:val="28"/>
+                <w:szCs w:val="28"/>
+                <w:lang w:val="en-US" w:eastAsia="zh-CN"/>
+              </w:rPr>
+              <w:t>。</w:t>
             </w:r>
           </w:p>
           <w:p>
@@ -1777,7 +2027,28 @@
                 <w:szCs w:val="28"/>
                 <w:lang w:val="en-US" w:eastAsia="zh-CN"/>
               </w:rPr>
-              <w:t>面向业务可用性，参赛团队需构建可解释输出机制，生成单公司或批量公司的监管问询概率、风险标签、主要诱因、相似历史案例、原文证据、预测窗口和模型置信度，并提供可运行的原型系统、API 服务或主流 Agentic AI 工具中可挂载的 Skill，支持投研与风控人员复核。</w:t>
+              <w:t>面向业务可用性，参赛团队需</w:t>
+            </w:r>
+            <w:r>
+              <w:rPr>
+                <w:rFonts w:hint="eastAsia" w:ascii="Times New Roman" w:hAnsi="Times New Roman" w:eastAsia="仿宋" w:cs="Times New Roman"/>
+                <w:color w:val="000000"/>
+                <w:sz w:val="28"/>
+                <w:szCs w:val="28"/>
+                <w:highlight w:val="yellow"/>
+                <w:lang w:val="en-US" w:eastAsia="zh-CN"/>
+              </w:rPr>
+              <w:t>构建可解释输出机制</w:t>
+            </w:r>
+            <w:r>
+              <w:rPr>
+                <w:rFonts w:hint="eastAsia" w:ascii="Times New Roman" w:hAnsi="Times New Roman" w:eastAsia="仿宋" w:cs="Times New Roman"/>
+                <w:color w:val="000000"/>
+                <w:sz w:val="28"/>
+                <w:szCs w:val="28"/>
+                <w:lang w:val="en-US" w:eastAsia="zh-CN"/>
+              </w:rPr>
+              <w:t>，生成单公司或批量公司的监管问询概率、风险标签、主要诱因、相似历史案例、原文证据、预测窗口和模型置信度，并提供可运行的原型系统、API 服务或主流 Agentic AI 工具中可挂载的 Skill，支持投研与风控人员复核。</w:t>
             </w:r>
           </w:p>
         </w:tc>
@@ -2011,9 +2282,20 @@
                 <w:color w:val="000000"/>
                 <w:sz w:val="28"/>
                 <w:szCs w:val="28"/>
-                <w:lang w:val="en-US" w:eastAsia="zh-CN"/>
-              </w:rPr>
-              <w:t>构建一套基于 Agentic AI 的上市公司扫雷预警系统，实现对上市公司未来受到监管问询概率的方向性预测、风险诱因归因和可解释报告生成。总体目标如下：</w:t>
+                <w:highlight w:val="yellow"/>
+                <w:lang w:val="en-US" w:eastAsia="zh-CN"/>
+              </w:rPr>
+              <w:t>构建一套基于 Agentic AI 的上市公司扫雷预警系统，实现对上市公司未来受到监管问询概率的方向性预测、风险诱因归因和可解释报告生成</w:t>
+            </w:r>
+            <w:r>
+              <w:rPr>
+                <w:rFonts w:hint="eastAsia" w:ascii="Times New Roman" w:hAnsi="Times New Roman" w:eastAsia="仿宋" w:cs="Times New Roman"/>
+                <w:color w:val="000000"/>
+                <w:sz w:val="28"/>
+                <w:szCs w:val="28"/>
+                <w:lang w:val="en-US" w:eastAsia="zh-CN"/>
+              </w:rPr>
+              <w:t>。总体目标如下：</w:t>
             </w:r>
           </w:p>
           <w:p>
@@ -2029,6 +2311,8 @@
                 <w:lang w:val="en-US" w:eastAsia="zh-CN"/>
               </w:rPr>
             </w:pPr>
+            <w:bookmarkStart w:id="0" w:name="_GoBack"/>
+            <w:bookmarkEnd w:id="0"/>
           </w:p>
           <w:p>
             <w:pPr>

</xml_diff>

<commit_message>
refactor: update color scheme and improve UI consistency across components
- Changed accent color from #3b82f6 to #4f8ff7 in History, McpTools, and MlMetrics pages for better visual harmony.
- Enhanced MCP interface description for clarity.
- Updated global CSS variables for a brighter theme and improved accessibility.
- Adjusted card and button styles for a more modern look.
- Improved responsiveness and hover effects for better user experience.
</commit_message>
<xml_diff>
--- a/06.docx
+++ b/06.docx
@@ -2311,8 +2311,6 @@
                 <w:lang w:val="en-US" w:eastAsia="zh-CN"/>
               </w:rPr>
             </w:pPr>
-            <w:bookmarkStart w:id="0" w:name="_GoBack"/>
-            <w:bookmarkEnd w:id="0"/>
           </w:p>
           <w:p>
             <w:pPr>
@@ -2841,7 +2839,28 @@
                 <w:szCs w:val="28"/>
                 <w:lang w:val="en-US" w:eastAsia="zh-CN"/>
               </w:rPr>
-              <w:t>比赛专用上市公司信息披露与监管问询数据集（选取中国 A 股市场某连续 5 年历史区间，隐去真实年份或进行必要脱敏处理）：</w:t>
+              <w:t>比赛专用上市公司信息披露与监管问询数据集（选取中国 A 股市场某连续 5 年历史区间，</w:t>
+            </w:r>
+            <w:r>
+              <w:rPr>
+                <w:rFonts w:hint="eastAsia" w:ascii="Times New Roman" w:hAnsi="Times New Roman" w:eastAsia="仿宋" w:cs="Times New Roman"/>
+                <w:color w:val="000000"/>
+                <w:sz w:val="28"/>
+                <w:szCs w:val="28"/>
+                <w:highlight w:val="yellow"/>
+                <w:lang w:val="en-US" w:eastAsia="zh-CN"/>
+              </w:rPr>
+              <w:t>隐去真实年份</w:t>
+            </w:r>
+            <w:r>
+              <w:rPr>
+                <w:rFonts w:hint="eastAsia" w:ascii="Times New Roman" w:hAnsi="Times New Roman" w:eastAsia="仿宋" w:cs="Times New Roman"/>
+                <w:color w:val="000000"/>
+                <w:sz w:val="28"/>
+                <w:szCs w:val="28"/>
+                <w:lang w:val="en-US" w:eastAsia="zh-CN"/>
+              </w:rPr>
+              <w:t>或进行必要脱敏处理）：</w:t>
             </w:r>
           </w:p>
           <w:p>
@@ -2980,6 +2999,8 @@
               </w:rPr>
               <w:t>以历史监管问询发生情况作为预测标签，按时间切分训练集、验证集和测试集，建议比例为 7:1:2；同时提供部分人工标注的监管关注点、风险诱因、证据片段和相似案例参考答案，用于评估语义抽取、归因解释和案例匹配能力。</w:t>
             </w:r>
+            <w:bookmarkStart w:id="0" w:name="_GoBack"/>
+            <w:bookmarkEnd w:id="0"/>
           </w:p>
         </w:tc>
       </w:tr>
@@ -3182,7 +3203,7 @@
     <w:lsdException w:uiPriority="99" w:name="Document Map"/>
     <w:lsdException w:uiPriority="99" w:name="Plain Text"/>
     <w:lsdException w:uiPriority="99" w:name="E-mail Signature"/>
-    <w:lsdException w:uiPriority="99" w:name="Normal (Web)"/>
+    <w:lsdException w:qFormat="1" w:uiPriority="99" w:name="Normal (Web)"/>
     <w:lsdException w:uiPriority="99" w:name="HTML Acronym"/>
     <w:lsdException w:uiPriority="99" w:name="HTML Address"/>
     <w:lsdException w:uiPriority="99" w:name="HTML Cite"/>
@@ -3383,6 +3404,7 @@
     <w:basedOn w:val="1"/>
     <w:semiHidden/>
     <w:unhideWhenUsed/>
+    <w:qFormat/>
     <w:uiPriority w:val="99"/>
     <w:pPr>
       <w:spacing w:before="0" w:beforeAutospacing="1" w:after="0" w:afterAutospacing="1"/>

</xml_diff>